<commit_message>
updated already existing indicators and included labour
</commit_message>
<xml_diff>
--- a/MPI_10092026/Africa_MPI_Collector_Progress_Report.docx
+++ b/MPI_10092026/Africa_MPI_Collector_Progress_Report.docx
@@ -579,7 +579,7 @@
               <w:rPr>
                 <w:sz w:val="16"/>
               </w:rPr>
-              <w:t>static_url (Tier-1 API)</w:t>
+              <w:t>NSO data API, 3 table(s) (Tier-1 API)</w:t>
             </w:r>
           </w:p>
         </w:tc>
@@ -875,7 +875,7 @@
               <w:rPr>
                 <w:sz w:val="16"/>
               </w:rPr>
-              <w:t>NSO (NBS)</w:t>
+              <w:t>NSO (National Bureau of Statistics)</w:t>
             </w:r>
           </w:p>
         </w:tc>

</xml_diff>